<commit_message>
feat: experiment system v2, layout fix, UX improvements
- Fix: 6 bugs in TimelinePanel.tsx (typos in class names and function calls)
- Fix: 5 type name typos in StateViewer.tsx
- Fix: import casing and stopReplay typo in Workspace.tsx
- Feat: Experiment type expanded with difficulty, concepts, hypothesis, reflection
- Feat: 10 complete experiments across Strings, Lists, Sets, Hashes, TTL, Errors
- Feat: Step-by-step experiment runner — one command at a time
- Feat: Experiment library page with card grid
- Feat: Reflection questions shown on experiment completion
- UX:  Layout changed to 25/45/30 column split
- UX:  TTL text 16px, bar 5px thick, pulses red at <=10s
- UX:  String value text 18px — values are the hero
- UX:  Diff panel flashes on update
- UX:  Card slide-in animation on creation
- Docs: alpha.md, first-user-observations.md
</commit_message>
<xml_diff>
--- a/Redis Lab Prototype document.docx
+++ b/Redis Lab Prototype document.docx
@@ -514,6 +514,32 @@
           <w:lang w:val="en-US"/>
         </w:rPr>
         <w:t>I have made a configuration for the CommandConsole.ts file in frontend. For the keyboardevent import I just put a type on it. So if it goes wrong. I know who to blame.</w:t>
+      </w:r>
+    </w:p>
+    <w:p>
+      <w:pPr>
+        <w:rPr>
+          <w:lang w:val="en-US"/>
+        </w:rPr>
+      </w:pPr>
+    </w:p>
+    <w:p>
+      <w:pPr>
+        <w:rPr>
+          <w:lang w:val="en-US"/>
+        </w:rPr>
+      </w:pPr>
+      <w:r>
+        <w:rPr>
+          <w:lang w:val="en-US"/>
+        </w:rPr>
+        <w:t xml:space="preserve">Ok the main idea behind the project is seen. But I have countless changes in my head that would make this seem a lot more easier to use and be useful. </w:t>
+      </w:r>
+      <w:r>
+        <w:rPr>
+          <w:lang w:val="en-US"/>
+        </w:rPr>
+        <w:t>Like the three-way split could be maintained according to the aspect of the screen instead of just 3 equal lines</w:t>
       </w:r>
     </w:p>
     <w:p>

</xml_diff>